<commit_message>
Prompt coach live test: plant known answers in GRC-1 to GRC-4
Co-Authored-By: Claude Opus 5.5 (1M context) <noreply@anthropic.com>
Claude-Session: https://claude.ai/code/session_01Sp6bbiPXfwDc65dz8hiGei
</commit_message>
<xml_diff>
--- a/prompt-coach/research/live-tests/fixtures/grc_access_policy.docx
+++ b/prompt-coach/research/live-tests/fixtures/grc_access_policy.docx
@@ -30,6 +30,11 @@
         <w:t xml:space="preserve">Terminated users should lose access.</w:t>
       </w:r>
     </w:p>
+    <w:p>
+      <w:r>
+        <w:t xml:space="preserve">In an emergency, any manager may grant access by phone or email, and no ticket is required.</w:t>
+      </w:r>
+    </w:p>
   </w:body>
 </w:document>
 </file>

</xml_diff>